<commit_message>
docs: Add manual test cases v1 document and accessibility tests
- Add the manual test cases v1 document (Word) with critical flows,
  12 cases, defects, accessibility findings, Jira registry and AI usage
- Add the accessibility and usability tests v1 for the purchase flow
- Update the quality scope document to v1.1 with week 2 progress
- Move the documentation images to docs/evidencias
- Ignore Word lock files
</commit_message>
<xml_diff>
--- a/docs/Documento de Alcance de Calidad — PrestaShop.docx
+++ b/docs/Documento de Alcance de Calidad — PrestaShop.docx
@@ -12,7 +12,8 @@
     </w:p>
     <w:p>
       <w:r>
-        <w:t>Oct 7, 2026</w:t>
+        <w:rPr/>
+        <w:t xml:space="preserve">Oct 14, 2026 · versión 1.1</w:t>
       </w:r>
     </w:p>
     <w:p>
@@ -127,7 +128,8 @@
           </w:tcPr>
           <w:p>
             <w:r>
-              <w:t>1.0</w:t>
+              <w:rPr/>
+              <w:t xml:space="preserve">1.1</w:t>
             </w:r>
           </w:p>
         </w:tc>
@@ -161,6 +163,30 @@
           </w:tcPr>
           <w:p>
             <w:r>
+              <w:rPr/>
+              <w:t xml:space="preserve">Última actualización</w:t>
+            </w:r>
+          </w:p>
+        </w:tc>
+        <w:tc>
+          <w:tcPr>
+            <w:tcW w:w="4680" w:type="dxa"/>
+          </w:tcPr>
+          <w:p>
+            <w:r>
+              <w:rPr/>
+              <w:t xml:space="preserve">14-oct-2026</w:t>
+            </w:r>
+          </w:p>
+        </w:tc>
+      </w:tr>
+      <w:tr>
+        <w:tc>
+          <w:tcPr>
+            <w:tcW w:w="4680" w:type="dxa"/>
+          </w:tcPr>
+          <w:p>
+            <w:r>
               <w:t>Autor</w:t>
             </w:r>
           </w:p>
@@ -211,7 +237,8 @@
           </w:tcPr>
           <w:p>
             <w:r>
-              <w:t xml:space="preserve">Emitido para revisión</w:t>
+              <w:rPr/>
+              <w:t xml:space="preserve">Actualizado con los resultados de la semana 2</w:t>
             </w:r>
           </w:p>
         </w:tc>
@@ -393,6 +420,52 @@
           </w:p>
         </w:tc>
       </w:tr>
+      <w:tr>
+        <w:tc>
+          <w:tcPr>
+            <w:tcW w:w="2340" w:type="dxa"/>
+          </w:tcPr>
+          <w:p>
+            <w:r>
+              <w:rPr/>
+              <w:t xml:space="preserve">1.1</w:t>
+            </w:r>
+          </w:p>
+        </w:tc>
+        <w:tc>
+          <w:tcPr>
+            <w:tcW w:w="2340" w:type="dxa"/>
+          </w:tcPr>
+          <w:p>
+            <w:r>
+              <w:rPr/>
+              <w:t xml:space="preserve">14-oct-2026</w:t>
+            </w:r>
+          </w:p>
+        </w:tc>
+        <w:tc>
+          <w:tcPr>
+            <w:tcW w:w="2340" w:type="dxa"/>
+          </w:tcPr>
+          <w:p>
+            <w:r>
+              <w:rPr/>
+              <w:t xml:space="preserve">Dante Tárraga</w:t>
+            </w:r>
+          </w:p>
+        </w:tc>
+        <w:tc>
+          <w:tcPr>
+            <w:tcW w:w="2340" w:type="dxa"/>
+          </w:tcPr>
+          <w:p>
+            <w:r>
+              <w:rPr/>
+              <w:t xml:space="preserve">Resultados de la semana 2: entorno real (Chrome 155, Jira), producto base de prueba, riesgo de accesibilidad automática, estado de avance y referencias</w:t>
+            </w:r>
+          </w:p>
+        </w:tc>
+      </w:tr>
     </w:tbl>
     <w:p>
       <w:pPr>
@@ -541,7 +614,8 @@
           </w:tcPr>
           <w:p>
             <w:r>
-              <w:t>PrestaShop 9.2.0 (observada el 07-oct-2026)</w:t>
+              <w:rPr/>
+              <w:t xml:space="preserve">PrestaShop 9.2.0, con el tema Hummingbird en el front office (confirmada el 07, 09 y 14-oct-2026)</w:t>
             </w:r>
           </w:p>
         </w:tc>
@@ -1525,7 +1599,8 @@
           </w:tcPr>
           <w:p>
             <w:r>
-              <w:t xml:space="preserve">Un navegador de escritorio actualizado, el mismo durante todo el módulo</w:t>
+              <w:rPr/>
+              <w:t xml:space="preserve">Google Chrome 155 de escritorio, el mismo durante todo el módulo; DevTools para red, árbol de accesibilidad y Lighthouse</w:t>
             </w:r>
           </w:p>
         </w:tc>
@@ -1569,8 +1644,18 @@
           </w:tcPr>
           <w:p>
             <w:r>
-              <w:t xml:space="preserve">Tablero Kanban en GitHub Projects o Trello</w:t>
-            </w:r>
+              <w:rPr/>
+              <w:t xml:space="preserve">Jira: proyecto PrestaShop QA (clave PS), tablero con PS Sprint 1 (14 al 28-oct-2026): </w:t>
+            </w:r>
+            <w:hyperlink r:id="rId109">
+              <w:r>
+                <w:rPr>
+                  <w:color w:val="0B69C7"/>
+                  <w:u w:val="single"/>
+                </w:rPr>
+                <w:t xml:space="preserve">https://dantetarraga.atlassian.net/jira/software/projects/PS/boards/2</w:t>
+              </w:r>
+            </w:hyperlink>
           </w:p>
         </w:tc>
       </w:tr>
@@ -1591,7 +1676,8 @@
           </w:tcPr>
           <w:p>
             <w:r>
-              <w:t xml:space="preserve">Jira o TestRail (se introduce en la sesión 6)</w:t>
+              <w:rPr/>
+              <w:t xml:space="preserve">Jira (plan Free), con los tipos de incidencia Caso de prueba y Defecto y los estados Por hacer, En curso, Pasó, Falló y Cerrado</w:t>
             </w:r>
           </w:p>
         </w:tc>
@@ -1613,7 +1699,8 @@
           </w:tcPr>
           <w:p>
             <w:r>
-              <w:t xml:space="preserve">Capturas y grabaciones guardadas en la carpeta evidencias/ del repositorio</w:t>
+              <w:rPr/>
+              <w:t xml:space="preserve">Capturas guardadas en docs/evidencias/ del repositorio y adjuntas al defecto en Jira</w:t>
             </w:r>
           </w:p>
         </w:tc>
@@ -1769,6 +1856,41 @@
           <w:p>
             <w:r>
               <w:t xml:space="preserve">Back office: productos, pedidos y clientes</w:t>
+            </w:r>
+          </w:p>
+        </w:tc>
+      </w:tr>
+      <w:tr>
+        <w:tc>
+          <w:tcPr>
+            <w:tcW w:w="3120" w:type="dxa"/>
+          </w:tcPr>
+          <w:p>
+            <w:r>
+              <w:rPr/>
+              <w:t xml:space="preserve">Producto base</w:t>
+            </w:r>
+          </w:p>
+        </w:tc>
+        <w:tc>
+          <w:tcPr>
+            <w:tcW w:w="3120" w:type="dxa"/>
+          </w:tcPr>
+          <w:p>
+            <w:r>
+              <w:rPr/>
+              <w:t xml:space="preserve">Hummingbird printed t-shirt, talla S, color blanco (€22.94; stock 300; compra mínima 1)</w:t>
+            </w:r>
+          </w:p>
+        </w:tc>
+        <w:tc>
+          <w:tcPr>
+            <w:tcW w:w="3120" w:type="dxa"/>
+          </w:tcPr>
+          <w:p>
+            <w:r>
+              <w:rPr/>
+              <w:t xml:space="preserve">Casos del carrito (M04) y flujo de compra</w:t>
             </w:r>
           </w:p>
         </w:tc>
@@ -2117,7 +2239,8 @@
           </w:tcPr>
           <w:p>
             <w:r>
-              <w:t xml:space="preserve">Anotar la URL de la instancia, crear los datos al inicio de cada sesión y guardar capturas como evidencia</w:t>
+              <w:rPr/>
+              <w:t xml:space="preserve">Anotar la URL de la instancia, crear los datos al inicio de cada sesión y guardar capturas como evidencia. Se materializó: cada sesión usó una instancia distinta (tasteful-carpenter, miniature-railway, stormy-flock) y una dejó de responder con 502 al cerrar la pestaña de la demo</w:t>
             </w:r>
           </w:p>
         </w:tc>
@@ -2333,6 +2456,63 @@
           <w:p>
             <w:r>
               <w:t xml:space="preserve">Verificar el flujo hasta la confirmación y su registro en el back office; declarar que no se prueba un cobro real</w:t>
+            </w:r>
+          </w:p>
+        </w:tc>
+      </w:tr>
+      <w:tr>
+        <w:tc>
+          <w:tcPr>
+            <w:tcW w:w="1872" w:type="dxa"/>
+          </w:tcPr>
+          <w:p>
+            <w:r>
+              <w:rPr/>
+              <w:t xml:space="preserve">R07</w:t>
+            </w:r>
+          </w:p>
+        </w:tc>
+        <w:tc>
+          <w:tcPr>
+            <w:tcW w:w="1872" w:type="dxa"/>
+          </w:tcPr>
+          <w:p>
+            <w:r>
+              <w:rPr/>
+              <w:t xml:space="preserve">Las herramientas automáticas de accesibilidad dan un puntaje alto aunque haya problemas (Lighthouse dio 100 en el checkout con 3 hallazgos manuales)</w:t>
+            </w:r>
+          </w:p>
+        </w:tc>
+        <w:tc>
+          <w:tcPr>
+            <w:tcW w:w="1872" w:type="dxa"/>
+          </w:tcPr>
+          <w:p>
+            <w:r>
+              <w:rPr/>
+              <w:t xml:space="preserve">Alta</w:t>
+            </w:r>
+          </w:p>
+        </w:tc>
+        <w:tc>
+          <w:tcPr>
+            <w:tcW w:w="1872" w:type="dxa"/>
+          </w:tcPr>
+          <w:p>
+            <w:r>
+              <w:rPr/>
+              <w:t xml:space="preserve">Medio</w:t>
+            </w:r>
+          </w:p>
+        </w:tc>
+        <w:tc>
+          <w:tcPr>
+            <w:tcW w:w="1872" w:type="dxa"/>
+          </w:tcPr>
+          <w:p>
+            <w:r>
+              <w:rPr/>
+              <w:t xml:space="preserve">Aplicar siempre las cinco pruebas rápidas manuales (teclado, contraste, texto alternativo, formularios y nombres) además de la herramienta</w:t>
             </w:r>
           </w:p>
         </w:tc>
@@ -2657,7 +2837,8 @@
           </w:tcPr>
           <w:p>
             <w:r>
-              <w:t xml:space="preserve">Repositorio inicial del proyecto en Git, con README y documento de alcance de calidad</w:t>
+              <w:rPr/>
+              <w:t xml:space="preserve">Repositorio inicial del proyecto en Git, con README y documento de alcance de calidad. Completado</w:t>
             </w:r>
           </w:p>
         </w:tc>
@@ -2699,7 +2880,8 @@
           </w:tcPr>
           <w:p>
             <w:r>
-              <w:t xml:space="preserve">Documento de casos de prueba manuales v1, con los flujos críticos mapeados</w:t>
+              <w:rPr/>
+              <w:t xml:space="preserve">Documento de casos de prueba manuales v1, con los flujos críticos mapeados. Completado: 12 casos del carrito (M04), 2 defectos, 3 hallazgos de accesibilidad y registro en Jira</w:t>
             </w:r>
           </w:p>
         </w:tc>
@@ -2767,7 +2949,269 @@
         <w:pStyle w:val="Ttulo2"/>
       </w:pPr>
       <w:r>
-        <w:t xml:space="preserve">10. Referencias</w:t>
+        <w:rPr/>
+        <w:t xml:space="preserve">10. Estado de avance al 14-oct-2026</w:t>
+      </w:r>
+    </w:p>
+    <w:p>
+      <w:r>
+        <w:rPr/>
+        <w:t xml:space="preserve">Avance respecto de los criterios de salida de la sección 6, al cierre de la semana 2. El detalle está en el documento </w:t>
+      </w:r>
+      <w:r>
+        <w:rPr>
+          <w:b/>
+          <w:bCs/>
+        </w:rPr>
+        <w:t xml:space="preserve">Casos de prueba manuales v1 — PrestaShop</w:t>
+      </w:r>
+      <w:r>
+        <w:rPr/>
+        <w:t xml:space="preserve"> y en el tablero de Jira.</w:t>
+      </w:r>
+    </w:p>
+    <w:tbl>
+      <w:tblPr>
+        <w:tblStyle w:val="Tablaconcuadrcula"/>
+        <w:tblW w:w="0" w:type="auto"/>
+        <w:tblLayout w:type="fixed"/>
+        <w:tblLook w:val="0420" w:firstRow="1" w:lastRow="0" w:firstColumn="0" w:lastColumn="0" w:noHBand="0" w:noVBand="1"/>
+      </w:tblPr>
+      <w:tblGrid>
+        <w:gridCol w:w="3600"/>
+        <w:gridCol w:w="1500"/>
+        <w:gridCol w:w="4260"/>
+      </w:tblGrid>
+      <w:tr>
+        <w:trPr>
+          <w:tblHeader/>
+        </w:trPr>
+        <w:tc>
+          <w:tcPr>
+            <w:tcW w:w="3600" w:type="dxa"/>
+            <w:shd w:val="clear" w:color="auto" w:fill="F2F2F2"/>
+          </w:tcPr>
+          <w:p>
+            <w:r>
+              <w:rPr/>
+              <w:t xml:space="preserve">Criterio de salida</w:t>
+            </w:r>
+          </w:p>
+        </w:tc>
+        <w:tc>
+          <w:tcPr>
+            <w:tcW w:w="1500" w:type="dxa"/>
+            <w:shd w:val="clear" w:color="auto" w:fill="F2F2F2"/>
+          </w:tcPr>
+          <w:p>
+            <w:r>
+              <w:rPr/>
+              <w:t xml:space="preserve">Estado</w:t>
+            </w:r>
+          </w:p>
+        </w:tc>
+        <w:tc>
+          <w:tcPr>
+            <w:tcW w:w="4260" w:type="dxa"/>
+            <w:shd w:val="clear" w:color="auto" w:fill="F2F2F2"/>
+          </w:tcPr>
+          <w:p>
+            <w:r>
+              <w:rPr/>
+              <w:t xml:space="preserve">Avance</w:t>
+            </w:r>
+          </w:p>
+        </w:tc>
+      </w:tr>
+      <w:tr>
+        <w:tc>
+          <w:tcPr>
+            <w:tcW w:w="3600" w:type="dxa"/>
+          </w:tcPr>
+          <w:p>
+            <w:r>
+              <w:rPr/>
+              <w:t xml:space="preserve">Casos diseñados y ejecutados en los módulos de prioridad alta</w:t>
+            </w:r>
+          </w:p>
+        </w:tc>
+        <w:tc>
+          <w:tcPr>
+            <w:tcW w:w="1500" w:type="dxa"/>
+          </w:tcPr>
+          <w:p>
+            <w:r>
+              <w:rPr/>
+              <w:t xml:space="preserve">Parcial</w:t>
+            </w:r>
+          </w:p>
+        </w:tc>
+        <w:tc>
+          <w:tcPr>
+            <w:tcW w:w="4260" w:type="dxa"/>
+          </w:tcPr>
+          <w:p>
+            <w:r>
+              <w:rPr/>
+              <w:t xml:space="preserve">M04: 12 casos ejecutados (4 pasaron, 8 fallaron). M05: flujo de compra recorrido y probado en accesibilidad. M01 y M02 pendientes para la semana 3</w:t>
+            </w:r>
+          </w:p>
+        </w:tc>
+      </w:tr>
+      <w:tr>
+        <w:tc>
+          <w:tcPr>
+            <w:tcW w:w="3600" w:type="dxa"/>
+          </w:tcPr>
+          <w:p>
+            <w:r>
+              <w:rPr/>
+              <w:t xml:space="preserve">Requisitos vinculados en la matriz de trazabilidad</w:t>
+            </w:r>
+          </w:p>
+        </w:tc>
+        <w:tc>
+          <w:tcPr>
+            <w:tcW w:w="1500" w:type="dxa"/>
+          </w:tcPr>
+          <w:p>
+            <w:r>
+              <w:rPr/>
+              <w:t xml:space="preserve">Pendiente</w:t>
+            </w:r>
+          </w:p>
+        </w:tc>
+        <w:tc>
+          <w:tcPr>
+            <w:tcW w:w="4260" w:type="dxa"/>
+          </w:tcPr>
+          <w:p>
+            <w:r>
+              <w:rPr/>
+              <w:t xml:space="preserve">Entregable de la semana 3</w:t>
+            </w:r>
+          </w:p>
+        </w:tc>
+      </w:tr>
+      <w:tr>
+        <w:tc>
+          <w:tcPr>
+            <w:tcW w:w="3600" w:type="dxa"/>
+          </w:tcPr>
+          <w:p>
+            <w:r>
+              <w:rPr/>
+              <w:t xml:space="preserve">Al menos 5 defectos documentados</w:t>
+            </w:r>
+          </w:p>
+        </w:tc>
+        <w:tc>
+          <w:tcPr>
+            <w:tcW w:w="1500" w:type="dxa"/>
+          </w:tcPr>
+          <w:p>
+            <w:r>
+              <w:rPr/>
+              <w:t xml:space="preserve">Cumplido</w:t>
+            </w:r>
+          </w:p>
+        </w:tc>
+        <w:tc>
+          <w:tcPr>
+            <w:tcW w:w="4260" w:type="dxa"/>
+          </w:tcPr>
+          <w:p>
+            <w:r>
+              <w:rPr/>
+              <w:t xml:space="preserve">5 defectos: DEF-01 y DEF-02 (carrito) y A11Y-01 a A11Y-03 (accesibilidad), con pasos, esperado, obtenido, severidad y evidencia</w:t>
+            </w:r>
+          </w:p>
+        </w:tc>
+      </w:tr>
+      <w:tr>
+        <w:tc>
+          <w:tcPr>
+            <w:tcW w:w="3600" w:type="dxa"/>
+          </w:tcPr>
+          <w:p>
+            <w:r>
+              <w:rPr/>
+              <w:t xml:space="preserve">Una sesión de testing exploratorio</w:t>
+            </w:r>
+          </w:p>
+        </w:tc>
+        <w:tc>
+          <w:tcPr>
+            <w:tcW w:w="1500" w:type="dxa"/>
+          </w:tcPr>
+          <w:p>
+            <w:r>
+              <w:rPr/>
+              <w:t xml:space="preserve">Pendiente</w:t>
+            </w:r>
+          </w:p>
+        </w:tc>
+        <w:tc>
+          <w:tcPr>
+            <w:tcW w:w="4260" w:type="dxa"/>
+          </w:tcPr>
+          <w:p>
+            <w:r>
+              <w:rPr/>
+              <w:t xml:space="preserve">Planificada para la semana 3</w:t>
+            </w:r>
+          </w:p>
+        </w:tc>
+      </w:tr>
+      <w:tr>
+        <w:tc>
+          <w:tcPr>
+            <w:tcW w:w="3600" w:type="dxa"/>
+          </w:tcPr>
+          <w:p>
+            <w:r>
+              <w:rPr/>
+              <w:t xml:space="preserve">Sin defectos críticos sin documentar</w:t>
+            </w:r>
+          </w:p>
+        </w:tc>
+        <w:tc>
+          <w:tcPr>
+            <w:tcW w:w="1500" w:type="dxa"/>
+          </w:tcPr>
+          <w:p>
+            <w:r>
+              <w:rPr/>
+              <w:t xml:space="preserve">Cumplido</w:t>
+            </w:r>
+          </w:p>
+        </w:tc>
+        <w:tc>
+          <w:tcPr>
+            <w:tcW w:w="4260" w:type="dxa"/>
+          </w:tcPr>
+          <w:p>
+            <w:r>
+              <w:rPr/>
+              <w:t xml:space="preserve">Ningún defecto de severidad crítica; el más grave (DEF-02) es de severidad alta</w:t>
+            </w:r>
+          </w:p>
+        </w:tc>
+      </w:tr>
+    </w:tbl>
+    <w:p>
+      <w:r>
+        <w:rPr/>
+        <w:t xml:space="preserve">Se confirmó que el carrito no valida bien la cantidad (DEF-02) y que el total se calcula con el precio sin redondear (DEF-01): el riesgo «Totales incorrectos» del módulo M04 se materializó.</w:t>
+      </w:r>
+    </w:p>
+    <w:p>
+      <w:pPr>
+        <w:pStyle w:val="Ttulo2"/>
+      </w:pPr>
+      <w:r>
+        <w:rPr/>
+        <w:t xml:space="preserve">11. Referencias</w:t>
       </w:r>
     </w:p>
     <w:p>
@@ -2820,6 +3264,71 @@
       </w:pPr>
       <w:r>
         <w:t xml:space="preserve">Malla curricular del curso QA Automatizador (Tecsup Virtual): objetivos y entregables del Módulo 1.</w:t>
+      </w:r>
+    </w:p>
+    <w:p>
+      <w:pPr>
+        <w:pStyle w:val="Prrafodelista"/>
+        <w:numPr>
+          <w:ilvl w:val="0"/>
+          <w:numId w:val="6"/>
+        </w:numPr>
+      </w:pPr>
+      <w:r>
+        <w:rPr/>
+        <w:t xml:space="preserve">Tablero de Jira del proyecto PrestaShop QA: casos, defectos y sprint (</w:t>
+      </w:r>
+      <w:hyperlink r:id="rId109">
+        <w:r>
+          <w:rPr>
+            <w:color w:val="0B69C7"/>
+            <w:u w:val="single"/>
+          </w:rPr>
+          <w:t xml:space="preserve">https://dantetarraga.atlassian.net/jira/software/projects/PS/boards/2</w:t>
+        </w:r>
+      </w:hyperlink>
+      <w:r>
+        <w:rPr/>
+        <w:t xml:space="preserve">).</w:t>
+      </w:r>
+    </w:p>
+    <w:p>
+      <w:pPr>
+        <w:pStyle w:val="Prrafodelista"/>
+        <w:numPr>
+          <w:ilvl w:val="0"/>
+          <w:numId w:val="6"/>
+        </w:numPr>
+      </w:pPr>
+      <w:r>
+        <w:rPr/>
+        <w:t xml:space="preserve">Casos de prueba manuales v1 — PrestaShop: casos, defectos y hallazgos de la semana 2 (docs/ del repositorio).</w:t>
+      </w:r>
+    </w:p>
+    <w:p>
+      <w:pPr>
+        <w:pStyle w:val="Prrafodelista"/>
+        <w:numPr>
+          <w:ilvl w:val="0"/>
+          <w:numId w:val="6"/>
+        </w:numPr>
+      </w:pPr>
+      <w:r>
+        <w:rPr/>
+        <w:t xml:space="preserve">WCAG 2.2 Quick Reference: criterios citados en los hallazgos de accesibilidad (</w:t>
+      </w:r>
+      <w:hyperlink r:id="rId210">
+        <w:r>
+          <w:rPr>
+            <w:color w:val="0B69C7"/>
+            <w:u w:val="single"/>
+          </w:rPr>
+          <w:t xml:space="preserve">https://www.w3.org/WAI/WCAG22/quickref/</w:t>
+        </w:r>
+      </w:hyperlink>
+      <w:r>
+        <w:rPr/>
+        <w:t xml:space="preserve">).</w:t>
       </w:r>
     </w:p>
     <w:sectPr>

</xml_diff>

<commit_message>
docs: Complete week 3 with exploratory session 1 and decision table
- Fill exploratory session 1 notes (registration form, easy-orange instance)
- Add decision table v1 for account registration (3 conditions, 4 cases)
- Add DEF-03 and DEF-04 to the defect report with evidence
- Update traceability matrix (R6 covered in part, coverage 71 %)
- Update test plan to v1.1 and quality scope document to v1.2
- Update README deliverables and status

Co-Authored-By: Claude Opus 5.5 <noreply@anthropic.com>
</commit_message>
<xml_diff>
--- a/docs/Documento de Alcance de Calidad — PrestaShop.docx
+++ b/docs/Documento de Alcance de Calidad — PrestaShop.docx
@@ -13,7 +13,7 @@
     <w:p>
       <w:r>
         <w:rPr/>
-        <w:t xml:space="preserve">Oct 14, 2026 · versión 1.1</w:t>
+        <w:t xml:space="preserve">Oct 21, 2026 · versión 1.2</w:t>
       </w:r>
     </w:p>
     <w:p>
@@ -129,7 +129,7 @@
           <w:p>
             <w:r>
               <w:rPr/>
-              <w:t xml:space="preserve">1.1</w:t>
+              <w:t xml:space="preserve">1.2</w:t>
             </w:r>
           </w:p>
         </w:tc>
@@ -175,7 +175,7 @@
           <w:p>
             <w:r>
               <w:rPr/>
-              <w:t xml:space="preserve">14-oct-2026</w:t>
+              <w:t xml:space="preserve">21-oct-2026</w:t>
             </w:r>
           </w:p>
         </w:tc>
@@ -217,7 +217,12 @@
           <w:tcPr>
             <w:tcW w:w="4680" w:type="dxa"/>
           </w:tcPr>
-          <w:p/>
+          <w:p>
+            <w:r>
+              <w:rPr/>
+              <w:t xml:space="preserve">Instructor del curso (líder de QA)</w:t>
+            </w:r>
+          </w:p>
         </w:tc>
       </w:tr>
       <w:tr>
@@ -238,7 +243,7 @@
           <w:p>
             <w:r>
               <w:rPr/>
-              <w:t xml:space="preserve">Actualizado con los resultados de la semana 2</w:t>
+              <w:t xml:space="preserve">Actualizado con los resultados de la semana 3</w:t>
             </w:r>
           </w:p>
         </w:tc>
@@ -462,6 +467,52 @@
             <w:r>
               <w:rPr/>
               <w:t xml:space="preserve">Resultados de la semana 2: entorno real (Chrome 155, Jira), producto base de prueba, riesgo de accesibilidad automática, estado de avance y referencias</w:t>
+            </w:r>
+          </w:p>
+        </w:tc>
+      </w:tr>
+      <w:tr>
+        <w:tc>
+          <w:tcPr>
+            <w:tcW w:w="2340" w:type="dxa"/>
+          </w:tcPr>
+          <w:p>
+            <w:r>
+              <w:rPr/>
+              <w:t xml:space="preserve">1.2</w:t>
+            </w:r>
+          </w:p>
+        </w:tc>
+        <w:tc>
+          <w:tcPr>
+            <w:tcW w:w="2340" w:type="dxa"/>
+          </w:tcPr>
+          <w:p>
+            <w:r>
+              <w:rPr/>
+              <w:t xml:space="preserve">21-oct-2026</w:t>
+            </w:r>
+          </w:p>
+        </w:tc>
+        <w:tc>
+          <w:tcPr>
+            <w:tcW w:w="2340" w:type="dxa"/>
+          </w:tcPr>
+          <w:p>
+            <w:r>
+              <w:rPr/>
+              <w:t xml:space="preserve">Dante Tárraga</w:t>
+            </w:r>
+          </w:p>
+        </w:tc>
+        <w:tc>
+          <w:tcPr>
+            <w:tcW w:w="2340" w:type="dxa"/>
+          </w:tcPr>
+          <w:p>
+            <w:r>
+              <w:rPr/>
+              <w:t xml:space="preserve">Resultados de la semana 3: plan de pruebas, matriz de trazabilidad, tabla de decisión, sesión exploratoria 1, reporte con 7 defectos, revisor, estado de avance y referencias</w:t>
             </w:r>
           </w:p>
         </w:tc>
@@ -2240,7 +2291,7 @@
           <w:p>
             <w:r>
               <w:rPr/>
-              <w:t xml:space="preserve">Anotar la URL de la instancia, crear los datos al inicio de cada sesión y guardar capturas como evidencia. Se materializó: cada sesión usó una instancia distinta (tasteful-carpenter, miniature-railway, stormy-flock) y una dejó de responder con 502 al cerrar la pestaña de la demo</w:t>
+              <w:t xml:space="preserve">Anotar la URL de la instancia, crear los datos al inicio de cada sesión y guardar capturas como evidencia. Se materializó: cada sesión usó una instancia distinta (tasteful-carpenter, miniature-railway, stormy-flock, easy-orange) y una dejó de responder con 502 al cerrar la pestaña de la demo</w:t>
             </w:r>
           </w:p>
         </w:tc>
@@ -2923,7 +2974,8 @@
           </w:tcPr>
           <w:p>
             <w:r>
-              <w:t xml:space="preserve">Plan de pruebas, matriz de trazabilidad y reporte de al menos 5 defectos documentados</w:t>
+              <w:rPr/>
+              <w:t xml:space="preserve">Plan de pruebas, matriz de trazabilidad y reporte de al menos 5 defectos documentados. Completado: plan de pruebas v1.1, matriz (cobertura 71 %), tabla de decisión del registro, sesión exploratoria 1 y reporte con 7 defectos</w:t>
             </w:r>
           </w:p>
         </w:tc>
@@ -2950,24 +3002,13 @@
       </w:pPr>
       <w:r>
         <w:rPr/>
-        <w:t xml:space="preserve">10. Estado de avance al 14-oct-2026</w:t>
+        <w:t xml:space="preserve">10. Estado de avance al 21-oct-2026</w:t>
       </w:r>
     </w:p>
     <w:p>
       <w:r>
         <w:rPr/>
-        <w:t xml:space="preserve">Avance respecto de los criterios de salida de la sección 6, al cierre de la semana 2. El detalle está en el documento </w:t>
-      </w:r>
-      <w:r>
-        <w:rPr>
-          <w:b/>
-          <w:bCs/>
-        </w:rPr>
-        <w:t xml:space="preserve">Casos de prueba manuales v1 — PrestaShop</w:t>
-      </w:r>
-      <w:r>
-        <w:rPr/>
-        <w:t xml:space="preserve"> y en el tablero de Jira.</w:t>
+        <w:t xml:space="preserve">Avance respecto de los criterios de salida de la sección 6, al cierre de la semana 3. El detalle está en el Plan de pruebas v1, la Matriz de trazabilidad v1, el Reporte de defectos v1, la Tabla de decisión v1 y el tablero de Jira.</w:t>
       </w:r>
     </w:p>
     <w:tbl>
@@ -3053,7 +3094,7 @@
           <w:p>
             <w:r>
               <w:rPr/>
-              <w:t xml:space="preserve">M04: 12 casos ejecutados (4 pasaron, 8 fallaron). M05: flujo de compra recorrido y probado en accesibilidad. M01 y M02 pendientes para la semana 3</w:t>
+              <w:t xml:space="preserve">M04: 12 casos ejecutados (4 pasaron, 8 fallaron). M01: tabla de decisión con 4 casos (1 ejecutado, 3 por ejecutar) y sesión exploratoria 1. M05: flujo de compra probado en accesibilidad. M02 sin casos</w:t>
             </w:r>
           </w:p>
         </w:tc>
@@ -3077,7 +3118,7 @@
           <w:p>
             <w:r>
               <w:rPr/>
-              <w:t xml:space="preserve">Pendiente</w:t>
+              <w:t xml:space="preserve">Parcial</w:t>
             </w:r>
           </w:p>
         </w:tc>
@@ -3088,7 +3129,7 @@
           <w:p>
             <w:r>
               <w:rPr/>
-              <w:t xml:space="preserve">Entregable de la semana 3</w:t>
+              <w:t xml:space="preserve">Matriz de trazabilidad v1: 7 requisitos, 5 con casos (71 %); sin casos R4 (compra completa) y R7 (catálogo)</w:t>
             </w:r>
           </w:p>
         </w:tc>
@@ -3123,7 +3164,7 @@
           <w:p>
             <w:r>
               <w:rPr/>
-              <w:t xml:space="preserve">5 defectos: DEF-01 y DEF-02 (carrito) y A11Y-01 a A11Y-03 (accesibilidad), con pasos, esperado, obtenido, severidad y evidencia</w:t>
+              <w:t xml:space="preserve">7 defectos: DEF-01 a DEF-04 (carrito y registro) y A11Y-01 a A11Y-03 (accesibilidad), con pasos, esperado, obtenido, severidad y evidencia. DEF-03 y DEF-04 por registrar en Jira</w:t>
             </w:r>
           </w:p>
         </w:tc>
@@ -3147,7 +3188,7 @@
           <w:p>
             <w:r>
               <w:rPr/>
-              <w:t xml:space="preserve">Pendiente</w:t>
+              <w:t xml:space="preserve">Cumplido</w:t>
             </w:r>
           </w:p>
         </w:tc>
@@ -3158,7 +3199,7 @@
           <w:p>
             <w:r>
               <w:rPr/>
-              <w:t xml:space="preserve">Planificada para la semana 3</w:t>
+              <w:t xml:space="preserve">Sesión exploratoria 1 (21-oct-2026) sobre el registro de cuenta, con charter, notas etiquetadas y 2 defectos</w:t>
             </w:r>
           </w:p>
         </w:tc>
@@ -3193,7 +3234,7 @@
           <w:p>
             <w:r>
               <w:rPr/>
-              <w:t xml:space="preserve">Ningún defecto de severidad crítica; el más grave (DEF-02) es de severidad alta</w:t>
+              <w:t xml:space="preserve">Ningún defecto de severidad crítica; los más graves (DEF-02 y A11Y-02) son de severidad alta</w:t>
             </w:r>
           </w:p>
         </w:tc>
@@ -3203,6 +3244,12 @@
       <w:r>
         <w:rPr/>
         <w:t xml:space="preserve">Se confirmó que el carrito no valida bien la cantidad (DEF-02) y que el total se calcula con el precio sin redondear (DEF-01): el riesgo «Totales incorrectos» del módulo M04 se materializó.</w:t>
+      </w:r>
+    </w:p>
+    <w:p>
+      <w:r>
+        <w:rPr/>
+        <w:t xml:space="preserve">En el registro de cuenta (M01), el servidor responde con un error 500 a un correo que termina en «@» (DEF-03) y culpa al formato cuando la fecha de nacimiento es futura (DEF-04): el riesgo «El cliente no puede acceder a su cuenta» sigue abierto hasta probar la creación real de la cuenta.</w:t>
       </w:r>
     </w:p>
     <w:p>
@@ -3303,6 +3350,19 @@
       <w:r>
         <w:rPr/>
         <w:t xml:space="preserve">Casos de prueba manuales v1 — PrestaShop: casos, defectos y hallazgos de la semana 2 (docs/ del repositorio).</w:t>
+      </w:r>
+    </w:p>
+    <w:p>
+      <w:pPr>
+        <w:pStyle w:val="Prrafodelista"/>
+        <w:numPr>
+          <w:ilvl w:val="0"/>
+          <w:numId w:val="6"/>
+        </w:numPr>
+      </w:pPr>
+      <w:r>
+        <w:rPr/>
+        <w:t xml:space="preserve">Plan de pruebas v1, Matriz de trazabilidad v1, Reporte de defectos v1, Tabla de decisión v1 y sesión exploratoria 1: entregables de la semana 3 (docs/ del repositorio).</w:t>
       </w:r>
     </w:p>
     <w:p>

</xml_diff>

<commit_message>
docs: Add catalog test cases and simplify week 3 documents
- Add 18 catalog test cases for R7 (search, categories, filters, sort, variants)
- Add DEF-05 (search returns unrelated products) with evidence
- Update traceability matrix to 86 % coverage
- Simplify wording of the exploratory session, decision table, defect report,
  matrix, test plan, scope document and README

Co-Authored-By: Claude Opus 5.5 <noreply@anthropic.com>
</commit_message>
<xml_diff>
--- a/docs/Documento de Alcance de Calidad — PrestaShop.docx
+++ b/docs/Documento de Alcance de Calidad — PrestaShop.docx
@@ -220,7 +220,7 @@
           <w:p>
             <w:r>
               <w:rPr/>
-              <w:t xml:space="preserve">Instructor del curso (líder de QA)</w:t>
+              <w:t xml:space="preserve">Instructor del curso</w:t>
             </w:r>
           </w:p>
         </w:tc>
@@ -512,7 +512,7 @@
           <w:p>
             <w:r>
               <w:rPr/>
-              <w:t xml:space="preserve">Resultados de la semana 3: plan de pruebas, matriz de trazabilidad, tabla de decisión, sesión exploratoria 1, reporte con 7 defectos, revisor, estado de avance y referencias</w:t>
+              <w:t xml:space="preserve">Resultados de la semana 3: plan, matriz, tabla de decisión, sesión exploratoria, casos del catálogo y 8 defectos</w:t>
             </w:r>
           </w:p>
         </w:tc>
@@ -2291,7 +2291,7 @@
           <w:p>
             <w:r>
               <w:rPr/>
-              <w:t xml:space="preserve">Anotar la URL de la instancia, crear los datos al inicio de cada sesión y guardar capturas como evidencia. Se materializó: cada sesión usó una instancia distinta (tasteful-carpenter, miniature-railway, stormy-flock, easy-orange) y una dejó de responder con 502 al cerrar la pestaña de la demo</w:t>
+              <w:t xml:space="preserve">Anotar la URL de la instancia, crear los datos al inicio de cada sesión y guardar capturas como evidencia. Se materializó: cada sesión usó una instancia distinta (tasteful-carpenter, miniature-railway, stormy-flock, easy-orange, noxious-line) y una dejó de responder con 502 al cerrar la pestaña de la demo</w:t>
             </w:r>
           </w:p>
         </w:tc>
@@ -2975,7 +2975,7 @@
           <w:p>
             <w:r>
               <w:rPr/>
-              <w:t xml:space="preserve">Plan de pruebas, matriz de trazabilidad y reporte de al menos 5 defectos documentados. Completado: plan de pruebas v1.1, matriz (cobertura 71 %), tabla de decisión del registro, sesión exploratoria 1 y reporte con 7 defectos</w:t>
+              <w:t xml:space="preserve">Plan de pruebas, matriz de trazabilidad y reporte de al menos 5 defectos documentados. Completado: plan, matriz (86 %), tabla de decisión, sesión exploratoria 1, casos del catálogo y 8 defectos</w:t>
             </w:r>
           </w:p>
         </w:tc>
@@ -3008,7 +3008,7 @@
     <w:p>
       <w:r>
         <w:rPr/>
-        <w:t xml:space="preserve">Avance respecto de los criterios de salida de la sección 6, al cierre de la semana 3. El detalle está en el Plan de pruebas v1, la Matriz de trazabilidad v1, el Reporte de defectos v1, la Tabla de decisión v1 y el tablero de Jira.</w:t>
+        <w:t xml:space="preserve">Avance respecto de los criterios de salida de la sección 6, al cierre de la semana 3. El detalle está en los documentos de la semana 3 y en Jira.</w:t>
       </w:r>
     </w:p>
     <w:tbl>
@@ -3094,7 +3094,7 @@
           <w:p>
             <w:r>
               <w:rPr/>
-              <w:t xml:space="preserve">M04: 12 casos ejecutados (4 pasaron, 8 fallaron). M01: tabla de decisión con 4 casos (1 ejecutado, 3 por ejecutar) y sesión exploratoria 1. M05: flujo de compra probado en accesibilidad. M02 sin casos</w:t>
+              <w:t xml:space="preserve">M04: 12 casos. M02: 18 casos. M01: tabla de decisión (1 de 4 casos ejecutado). M05: solo accesibilidad</w:t>
             </w:r>
           </w:p>
         </w:tc>
@@ -3129,7 +3129,7 @@
           <w:p>
             <w:r>
               <w:rPr/>
-              <w:t xml:space="preserve">Matriz de trazabilidad v1: 7 requisitos, 5 con casos (71 %); sin casos R4 (compra completa) y R7 (catálogo)</w:t>
+              <w:t xml:space="preserve">6 de 7 requisitos con casos (86 %). Falta R4 (compra completa)</w:t>
             </w:r>
           </w:p>
         </w:tc>
@@ -3164,7 +3164,7 @@
           <w:p>
             <w:r>
               <w:rPr/>
-              <w:t xml:space="preserve">7 defectos: DEF-01 a DEF-04 (carrito y registro) y A11Y-01 a A11Y-03 (accesibilidad), con pasos, esperado, obtenido, severidad y evidencia. DEF-03 y DEF-04 por registrar en Jira</w:t>
+              <w:t xml:space="preserve">8 defectos: DEF-01 a DEF-05 y A11Y-01 a A11Y-03. DEF-03 a DEF-05 por registrar en Jira</w:t>
             </w:r>
           </w:p>
         </w:tc>
@@ -3199,7 +3199,7 @@
           <w:p>
             <w:r>
               <w:rPr/>
-              <w:t xml:space="preserve">Sesión exploratoria 1 (21-oct-2026) sobre el registro de cuenta, con charter, notas etiquetadas y 2 defectos</w:t>
+              <w:t xml:space="preserve">Sesión exploratoria 1 (21-oct-2026) sobre el registro de cuenta, con 2 defectos</w:t>
             </w:r>
           </w:p>
         </w:tc>
@@ -3234,7 +3234,7 @@
           <w:p>
             <w:r>
               <w:rPr/>
-              <w:t xml:space="preserve">Ningún defecto de severidad crítica; los más graves (DEF-02 y A11Y-02) son de severidad alta</w:t>
+              <w:t xml:space="preserve">Ninguno crítico; los más graves (DEF-02 y A11Y-02) son de severidad alta</w:t>
             </w:r>
           </w:p>
         </w:tc>
@@ -3249,7 +3249,7 @@
     <w:p>
       <w:r>
         <w:rPr/>
-        <w:t xml:space="preserve">En el registro de cuenta (M01), el servidor responde con un error 500 a un correo que termina en «@» (DEF-03) y culpa al formato cuando la fecha de nacimiento es futura (DEF-04): el riesgo «El cliente no puede acceder a su cuenta» sigue abierto hasta probar la creación real de la cuenta.</w:t>
+        <w:t xml:space="preserve">En la semana 3 aparecieron 3 defectos más: un error 500 en el registro (DEF-03), un mensaje confuso para fechas futuras (DEF-04) y una búsqueda que muestra productos sin relación (DEF-05).</w:t>
       </w:r>
     </w:p>
     <w:p>
@@ -3362,7 +3362,7 @@
       </w:pPr>
       <w:r>
         <w:rPr/>
-        <w:t xml:space="preserve">Plan de pruebas v1, Matriz de trazabilidad v1, Reporte de defectos v1, Tabla de decisión v1 y sesión exploratoria 1: entregables de la semana 3 (docs/ del repositorio).</w:t>
+        <w:t xml:space="preserve">Documentos de la semana 3: plan de pruebas, matriz, reporte de defectos, tabla de decisión, sesión exploratoria 1 y casos del catálogo (docs/ del repositorio).</w:t>
       </w:r>
     </w:p>
     <w:p>

</xml_diff>

<commit_message>
docs: Add checkout cases, full purchase and Jira defects PS-20 to PS-22
- Add 9 checkout test cases and the full guest purchase for R4 (order OJJKGSAGV)
- Re-run CP-02 and CP-11 with size M black: DEF-01 and DEF-02 repeat
- Reproduce DEF-03 to DEF-05 and register them in Jira (PS-20, PS-21, PS-22)
- Update matrix to 100 % coverage and the plan, scope document and README

Co-Authored-By: Claude Opus 5.5 <noreply@anthropic.com>
</commit_message>
<xml_diff>
--- a/docs/Documento de Alcance de Calidad — PrestaShop.docx
+++ b/docs/Documento de Alcance de Calidad — PrestaShop.docx
@@ -512,7 +512,7 @@
           <w:p>
             <w:r>
               <w:rPr/>
-              <w:t xml:space="preserve">Resultados de la semana 3: plan, matriz, tabla de decisión, sesión exploratoria, casos del catálogo y 8 defectos</w:t>
+              <w:t xml:space="preserve">Resultados de la semana 3: plan, matriz, tabla de decisión, sesión exploratoria, casos del catálogo y del checkout, y 8 defectos</w:t>
             </w:r>
           </w:p>
         </w:tc>
@@ -2291,7 +2291,7 @@
           <w:p>
             <w:r>
               <w:rPr/>
-              <w:t xml:space="preserve">Anotar la URL de la instancia, crear los datos al inicio de cada sesión y guardar capturas como evidencia. Se materializó: cada sesión usó una instancia distinta (tasteful-carpenter, miniature-railway, stormy-flock, easy-orange, noxious-line) y una dejó de responder con 502 al cerrar la pestaña de la demo</w:t>
+              <w:t xml:space="preserve">Anotar la URL de la instancia, crear los datos al inicio de cada sesión y guardar capturas como evidencia. Se materializó: cada sesión usó una instancia distinta (tasteful-carpenter, miniature-railway, stormy-flock, easy-orange, noxious-line, previous-wrist) y una dejó de responder con 502 al cerrar la pestaña de la demo</w:t>
             </w:r>
           </w:p>
         </w:tc>
@@ -2975,7 +2975,7 @@
           <w:p>
             <w:r>
               <w:rPr/>
-              <w:t xml:space="preserve">Plan de pruebas, matriz de trazabilidad y reporte de al menos 5 defectos documentados. Completado: plan, matriz (86 %), tabla de decisión, sesión exploratoria 1, casos del catálogo y 8 defectos</w:t>
+              <w:t xml:space="preserve">Plan de pruebas, matriz de trazabilidad y reporte de al menos 5 defectos documentados. Completado: plan, matriz (100 %), tabla de decisión, sesión exploratoria 1, casos del catálogo y del checkout, y 8 defectos en Jira</w:t>
             </w:r>
           </w:p>
         </w:tc>
@@ -3083,7 +3083,7 @@
           <w:p>
             <w:r>
               <w:rPr/>
-              <w:t xml:space="preserve">Parcial</w:t>
+              <w:t xml:space="preserve">Casi</w:t>
             </w:r>
           </w:p>
         </w:tc>
@@ -3094,7 +3094,7 @@
           <w:p>
             <w:r>
               <w:rPr/>
-              <w:t xml:space="preserve">M04: 12 casos. M02: 18 casos. M01: tabla de decisión (1 de 4 casos ejecutado). M05: solo accesibilidad</w:t>
+              <w:t xml:space="preserve">M04: 12 casos. M02: 18 casos. M05: 9 casos del checkout. M01: tabla de decisión (faltan 3 casos que necesitan contraseña)</w:t>
             </w:r>
           </w:p>
         </w:tc>
@@ -3118,7 +3118,7 @@
           <w:p>
             <w:r>
               <w:rPr/>
-              <w:t xml:space="preserve">Parcial</w:t>
+              <w:t xml:space="preserve">Cumplido</w:t>
             </w:r>
           </w:p>
         </w:tc>
@@ -3129,7 +3129,7 @@
           <w:p>
             <w:r>
               <w:rPr/>
-              <w:t xml:space="preserve">6 de 7 requisitos con casos (86 %). Falta R4 (compra completa)</w:t>
+              <w:t xml:space="preserve">7 de 7 requisitos con casos (100 %)</w:t>
             </w:r>
           </w:p>
         </w:tc>
@@ -3164,7 +3164,7 @@
           <w:p>
             <w:r>
               <w:rPr/>
-              <w:t xml:space="preserve">8 defectos: DEF-01 a DEF-05 y A11Y-01 a A11Y-03. DEF-03 a DEF-05 por registrar en Jira</w:t>
+              <w:t xml:space="preserve">8 defectos: DEF-01 a DEF-05 y A11Y-01 a A11Y-03, todos en Jira</w:t>
             </w:r>
           </w:p>
         </w:tc>
@@ -3250,6 +3250,12 @@
       <w:r>
         <w:rPr/>
         <w:t xml:space="preserve">En la semana 3 aparecieron 3 defectos más: un error 500 en el registro (DEF-03), un mensaje confuso para fechas futuras (DEF-04) y una búsqueda que muestra productos sin relación (DEF-05).</w:t>
+      </w:r>
+    </w:p>
+    <w:p>
+      <w:r>
+        <w:rPr/>
+        <w:t xml:space="preserve">La compra completa como invitado funcionó: pedido OJJKGSAGV por €31.34 (camiseta €22.94 + envío €8.40).</w:t>
       </w:r>
     </w:p>
     <w:p>
@@ -3362,7 +3368,7 @@
       </w:pPr>
       <w:r>
         <w:rPr/>
-        <w:t xml:space="preserve">Documentos de la semana 3: plan de pruebas, matriz, reporte de defectos, tabla de decisión, sesión exploratoria 1 y casos del catálogo (docs/ del repositorio).</w:t>
+        <w:t xml:space="preserve">Documentos de la semana 3: plan de pruebas, matriz, reporte de defectos, tabla de decisión, sesión exploratoria 1, casos del catálogo y casos del checkout (docs/ del repositorio).</w:t>
       </w:r>
     </w:p>
     <w:p>

</xml_diff>